<commit_message>
Sync paper Markdown source with the author-revised Word paper
- docs_src/06_Research_Paper.md regenerated from 07_reports/06_Research_Paper.docx
  (round-trip rebuild verified: identical text, images and bold formatting in all 340 paragraphs/cells)
- Step summary notes the author revision

Co-Authored-By: Claude Opus 5.5 <noreply@anthropic.com>
</commit_message>
<xml_diff>
--- a/07_reports/05_Research_Step_Summary.docx
+++ b/07_reports/05_Research_Step_Summary.docx
@@ -13708,6 +13708,174 @@
           <w:trHeight w:val="360" w:hRule="auto"/>
         </w:trPr>
         body8
+        <w:tc>
+          <w:tcPr>
+            <w:tcBorders>
+              <w:bottom w:val="none" w:sz="0" w:space="0" w:color="000000"/>
+              <w:top w:val="none" w:sz="0" w:space="0" w:color="000000"/>
+              <w:left w:val="none" w:sz="0" w:space="0" w:color="000000"/>
+              <w:right w:val="none" w:sz="0" w:space="0" w:color="000000"/>
+            </w:tcBorders>
+            <w:shd w:val="clear" w:color="auto" w:fill="FFFFFF"/>
+            <w:tcMar>
+              <w:top w:w="0" w:type="dxa"/>
+              <w:bottom w:w="0" w:type="dxa"/>
+              <w:left w:w="0" w:type="dxa"/>
+              <w:right w:w="0" w:type="dxa"/>
+            </w:tcMar>
+            <w:vAlign w:val="top"/>
+          </w:tcPr>
+          <w:p>
+            <w:pPr>
+              <w:jc w:val="left"/>
+              <w:pBdr>
+                <w:bottom w:val="none" w:sz="0" w:space="0" w:color="000000"/>
+                <w:top w:val="none" w:sz="0" w:space="0" w:color="000000"/>
+                <w:left w:val="none" w:sz="0" w:space="0" w:color="000000"/>
+                <w:right w:val="none" w:sz="0" w:space="0" w:color="000000"/>
+              </w:pBdr>
+              <w:spacing w:after="40" w:before="40" w:line="240"/>
+              <w:ind w:left="40" w:right="40" w:firstLine="0" w:firstLineChars="0"/>
+              <w:rPr>
+                <w:rFonts w:ascii="Arial" w:hAnsi="Arial" w:eastAsia="Arial" w:cs="Arial"/>
+                <w:i w:val="false"/>
+                <w:b w:val="false"/>
+                <w:u w:val="none"/>
+                <w:strike w:val="false"/>
+                <w:sz w:val="17"/>
+                <w:szCs w:val="17"/>
+                <w:color w:val="000000"/>
+              </w:rPr>
+            </w:pPr>
+            <w:r>
+              <w:rPr>
+                <w:rFonts w:ascii="Arial" w:hAnsi="Arial" w:eastAsia="Arial" w:cs="Arial"/>
+                <w:i w:val="false"/>
+                <w:b w:val="false"/>
+                <w:u w:val="none"/>
+                <w:strike w:val="false"/>
+                <w:sz w:val="17"/>
+                <w:szCs w:val="17"/>
+                <w:color w:val="000000"/>
+              </w:rPr>
+              <w:t xml:space="preserve">Author revision of the paper (October 8, 2026)</w:t>
+            </w:r>
+          </w:p>
+        </w:tc>
+        <w:tc>
+          <w:tcPr>
+            <w:tcBorders>
+              <w:bottom w:val="none" w:sz="0" w:space="0" w:color="000000"/>
+              <w:top w:val="none" w:sz="0" w:space="0" w:color="000000"/>
+              <w:left w:val="none" w:sz="0" w:space="0" w:color="000000"/>
+              <w:right w:val="none" w:sz="0" w:space="0" w:color="000000"/>
+            </w:tcBorders>
+            <w:shd w:val="clear" w:color="auto" w:fill="FFFFFF"/>
+            <w:tcMar>
+              <w:top w:w="0" w:type="dxa"/>
+              <w:bottom w:w="0" w:type="dxa"/>
+              <w:left w:w="0" w:type="dxa"/>
+              <w:right w:w="0" w:type="dxa"/>
+            </w:tcMar>
+            <w:vAlign w:val="top"/>
+          </w:tcPr>
+          <w:p>
+            <w:pPr>
+              <w:jc w:val="left"/>
+              <w:pBdr>
+                <w:bottom w:val="none" w:sz="0" w:space="0" w:color="000000"/>
+                <w:top w:val="none" w:sz="0" w:space="0" w:color="000000"/>
+                <w:left w:val="none" w:sz="0" w:space="0" w:color="000000"/>
+                <w:right w:val="none" w:sz="0" w:space="0" w:color="000000"/>
+              </w:pBdr>
+              <w:spacing w:after="40" w:before="40" w:line="240"/>
+              <w:ind w:left="40" w:right="40" w:firstLine="0" w:firstLineChars="0"/>
+              <w:rPr>
+                <w:rFonts w:ascii="Arial" w:hAnsi="Arial" w:eastAsia="Arial" w:cs="Arial"/>
+                <w:i w:val="false"/>
+                <w:b w:val="false"/>
+                <w:u w:val="none"/>
+                <w:strike w:val="false"/>
+                <w:sz w:val="17"/>
+                <w:szCs w:val="17"/>
+                <w:color w:val="000000"/>
+              </w:rPr>
+            </w:pPr>
+            <w:r>
+              <w:rPr>
+                <w:rFonts w:ascii="Arial" w:hAnsi="Arial" w:eastAsia="Arial" w:cs="Arial"/>
+                <w:i w:val="false"/>
+                <w:b w:val="false"/>
+                <w:u w:val="none"/>
+                <w:strike w:val="false"/>
+                <w:sz w:val="17"/>
+                <w:szCs w:val="17"/>
+                <w:color w:val="000000"/>
+              </w:rPr>
+              <w:t xml:space="preserve">The author revised the paper's wording into formal academic voice and added Figures 2, 3 and 5 and Supplementary Figures S1-S3 (Schoenfeld residuals, both DAGs). The Markdown source (docs_src/06_Research_Paper.md) was updated to match, and a round-trip rebuild was checked to give identical text, images and formatting</w:t>
+            </w:r>
+          </w:p>
+        </w:tc>
+        <w:tc>
+          <w:tcPr>
+            <w:tcBorders>
+              <w:bottom w:val="none" w:sz="0" w:space="0" w:color="000000"/>
+              <w:top w:val="none" w:sz="0" w:space="0" w:color="000000"/>
+              <w:left w:val="none" w:sz="0" w:space="0" w:color="000000"/>
+              <w:right w:val="none" w:sz="0" w:space="0" w:color="000000"/>
+            </w:tcBorders>
+            <w:shd w:val="clear" w:color="auto" w:fill="FFFFFF"/>
+            <w:tcMar>
+              <w:top w:w="0" w:type="dxa"/>
+              <w:bottom w:w="0" w:type="dxa"/>
+              <w:left w:w="0" w:type="dxa"/>
+              <w:right w:w="0" w:type="dxa"/>
+            </w:tcMar>
+            <w:vAlign w:val="top"/>
+          </w:tcPr>
+          <w:p>
+            <w:pPr>
+              <w:jc w:val="left"/>
+              <w:pBdr>
+                <w:bottom w:val="none" w:sz="0" w:space="0" w:color="000000"/>
+                <w:top w:val="none" w:sz="0" w:space="0" w:color="000000"/>
+                <w:left w:val="none" w:sz="0" w:space="0" w:color="000000"/>
+                <w:right w:val="none" w:sz="0" w:space="0" w:color="000000"/>
+              </w:pBdr>
+              <w:spacing w:after="40" w:before="40" w:line="240"/>
+              <w:ind w:left="40" w:right="40" w:firstLine="0" w:firstLineChars="0"/>
+              <w:rPr>
+                <w:rFonts w:ascii="Arial" w:hAnsi="Arial" w:eastAsia="Arial" w:cs="Arial"/>
+                <w:i w:val="false"/>
+                <w:b w:val="false"/>
+                <w:u w:val="none"/>
+                <w:strike w:val="false"/>
+                <w:sz w:val="17"/>
+                <w:szCs w:val="17"/>
+                <w:color w:val="000000"/>
+              </w:rPr>
+            </w:pPr>
+            <w:r>
+              <w:rPr>
+                <w:rFonts w:ascii="Arial" w:hAnsi="Arial" w:eastAsia="Arial" w:cs="Arial"/>
+                <w:i w:val="false"/>
+                <w:b w:val="false"/>
+                <w:u w:val="none"/>
+                <w:strike w:val="false"/>
+                <w:sz w:val="17"/>
+                <w:szCs w:val="17"/>
+                <w:color w:val="000000"/>
+              </w:rPr>
+              <w:t xml:space="preserve">None on results</w:t>
+            </w:r>
+          </w:p>
+        </w:tc>
+      </w:tr>
+      <w:tr>
+        <w:trPr>
+          <w:trHeight w:val="360" w:hRule="auto"/>
+        </w:trPr>
+        body9
         <w:tc>
           <w:tcPr>
             <w:tcBorders>

</xml_diff>